<commit_message>
add link github to word
</commit_message>
<xml_diff>
--- a/TruongThiVan_Report_Lab2.docx
+++ b/TruongThiVan_Report_Lab2.docx
@@ -16,8 +16,61 @@
           <w:bCs/>
           <w:lang w:val="en-US"/>
         </w:rPr>
-        <w:t>Trương Thị Vân - 2331220034</w:t>
+        <w:t xml:space="preserve">Trương Thị Vân </w:t>
       </w:r>
+      <w:r>
+        <w:rPr>
+          <w:b/>
+          <w:bCs/>
+          <w:lang w:val="en-US"/>
+        </w:rPr>
+        <w:t>–</w:t>
+      </w:r>
+      <w:r>
+        <w:rPr>
+          <w:b/>
+          <w:bCs/>
+          <w:lang w:val="en-US"/>
+        </w:rPr>
+        <w:t xml:space="preserve"> 2331220034</w:t>
+      </w:r>
+    </w:p>
+    <w:p>
+      <w:pPr>
+        <w:rPr>
+          <w:b/>
+          <w:bCs/>
+          <w:lang w:val="en-US"/>
+        </w:rPr>
+      </w:pPr>
+      <w:r>
+        <w:rPr>
+          <w:b/>
+          <w:bCs/>
+          <w:lang w:val="en-US"/>
+        </w:rPr>
+        <w:t xml:space="preserve">LINK: </w:t>
+      </w:r>
+      <w:hyperlink r:id="rId5" w:history="1">
+        <w:r>
+          <w:rPr>
+            <w:rStyle w:val="Hyperlink"/>
+            <w:b/>
+            <w:bCs/>
+            <w:lang w:val="en-US"/>
+          </w:rPr>
+          <w:t>https://github.com/TruongVan-25/CSW430_LAB2.git</w:t>
+        </w:r>
+      </w:hyperlink>
+    </w:p>
+    <w:p>
+      <w:pPr>
+        <w:rPr>
+          <w:b/>
+          <w:bCs/>
+          <w:lang w:val="en-US"/>
+        </w:rPr>
+      </w:pPr>
     </w:p>
     <w:p>
       <w:pPr>
@@ -85,7 +138,7 @@
                     <pic:cNvPicPr/>
                   </pic:nvPicPr>
                   <pic:blipFill>
-                    <a:blip r:embed="rId5"/>
+                    <a:blip r:embed="rId6"/>
                     <a:stretch>
                       <a:fillRect/>
                     </a:stretch>
@@ -159,7 +212,7 @@
                     <pic:cNvPicPr/>
                   </pic:nvPicPr>
                   <pic:blipFill>
-                    <a:blip r:embed="rId6"/>
+                    <a:blip r:embed="rId7"/>
                     <a:stretch>
                       <a:fillRect/>
                     </a:stretch>
@@ -233,7 +286,7 @@
                     <pic:cNvPicPr/>
                   </pic:nvPicPr>
                   <pic:blipFill>
-                    <a:blip r:embed="rId7"/>
+                    <a:blip r:embed="rId8"/>
                     <a:stretch>
                       <a:fillRect/>
                     </a:stretch>
@@ -308,7 +361,7 @@
                     <pic:cNvPicPr/>
                   </pic:nvPicPr>
                   <pic:blipFill>
-                    <a:blip r:embed="rId8"/>
+                    <a:blip r:embed="rId9"/>
                     <a:stretch>
                       <a:fillRect/>
                     </a:stretch>
@@ -383,7 +436,7 @@
                     <pic:cNvPicPr/>
                   </pic:nvPicPr>
                   <pic:blipFill>
-                    <a:blip r:embed="rId9"/>
+                    <a:blip r:embed="rId10"/>
                     <a:stretch>
                       <a:fillRect/>
                     </a:stretch>
@@ -423,8 +476,18 @@
           <w:bCs/>
           <w:lang w:val="en-US"/>
         </w:rPr>
-        <w:t>Q3: LoginScreen</w:t>
+        <w:t xml:space="preserve">Q3: </w:t>
       </w:r>
+      <w:proofErr w:type="spellStart"/>
+      <w:r>
+        <w:rPr>
+          <w:b/>
+          <w:bCs/>
+          <w:lang w:val="en-US"/>
+        </w:rPr>
+        <w:t>LoginScreen</w:t>
+      </w:r>
+      <w:proofErr w:type="spellEnd"/>
     </w:p>
     <w:p>
       <w:pPr>
@@ -458,7 +521,7 @@
                     <pic:cNvPicPr/>
                   </pic:nvPicPr>
                   <pic:blipFill>
-                    <a:blip r:embed="rId10"/>
+                    <a:blip r:embed="rId11"/>
                     <a:stretch>
                       <a:fillRect/>
                     </a:stretch>
@@ -528,7 +591,7 @@
                     <pic:cNvPicPr/>
                   </pic:nvPicPr>
                   <pic:blipFill>
-                    <a:blip r:embed="rId11"/>
+                    <a:blip r:embed="rId12"/>
                     <a:stretch>
                       <a:fillRect/>
                     </a:stretch>
@@ -578,6 +641,7 @@
         <w:rPr>
           <w:b/>
           <w:bCs/>
+          <w:noProof/>
           <w:lang w:val="en-US"/>
         </w:rPr>
         <w:lastRenderedPageBreak/>
@@ -597,7 +661,7 @@
                     <pic:cNvPicPr/>
                   </pic:nvPicPr>
                   <pic:blipFill>
-                    <a:blip r:embed="rId12"/>
+                    <a:blip r:embed="rId13"/>
                     <a:stretch>
                       <a:fillRect/>
                     </a:stretch>
@@ -1755,6 +1819,29 @@
       <w:spacing w:val="5"/>
     </w:rPr>
   </w:style>
+  <w:style w:type="character" w:styleId="Hyperlink">
+    <w:name w:val="Hyperlink"/>
+    <w:basedOn w:val="DefaultParagraphFont"/>
+    <w:uiPriority w:val="99"/>
+    <w:unhideWhenUsed/>
+    <w:rsid w:val="003D782E"/>
+    <w:rPr>
+      <w:color w:val="467886" w:themeColor="hyperlink"/>
+      <w:u w:val="single"/>
+    </w:rPr>
+  </w:style>
+  <w:style w:type="character" w:styleId="UnresolvedMention">
+    <w:name w:val="Unresolved Mention"/>
+    <w:basedOn w:val="DefaultParagraphFont"/>
+    <w:uiPriority w:val="99"/>
+    <w:semiHidden/>
+    <w:unhideWhenUsed/>
+    <w:rsid w:val="003D782E"/>
+    <w:rPr>
+      <w:color w:val="605E5C"/>
+      <w:shd w:val="clear" w:color="auto" w:fill="E1DFDD"/>
+    </w:rPr>
+  </w:style>
 </w:styles>
 </file>
 

</xml_diff>